<commit_message>
Fix final KBS package manuscript PDF mismatch
Rebuild the revised manuscript after removing Algorithm 1, shortening the
guarded-fallback section, and reducing float-only pages so the upload
package PDF matches the current LaTeX source (38 pages).

Co-authored-by: Cursor <cursoragent@cursor.com>
</commit_message>
<xml_diff>
--- a/submission_kbs_revision_final/02_Response_to_Reviewers.docx
+++ b/submission_kbs_revision_final/02_Response_to_Reviewers.docx
@@ -1087,7 +1087,25 @@
         <w:t xml:space="preserve"> </w:t>
       </w:r>
       <w:r>
-        <w:t xml:space="preserve">a validated contribution. We confirm that no dedicated</w:t>
+        <w:t xml:space="preserve">a validated contribution. The method section no longer presents the guard</w:t>
+      </w:r>
+      <w:r>
+        <w:t xml:space="preserve"> </w:t>
+      </w:r>
+      <w:r>
+        <w:t xml:space="preserve">as a full algorithmic centerpiece: the former Algorithm~1 pseudocode block</w:t>
+      </w:r>
+      <w:r>
+        <w:t xml:space="preserve"> </w:t>
+      </w:r>
+      <w:r>
+        <w:t xml:space="preserve">has been removed and replaced with concise prose, and the guarded-fallback</w:t>
+      </w:r>
+      <w:r>
+        <w:t xml:space="preserve"> </w:t>
+      </w:r>
+      <w:r>
+        <w:t xml:space="preserve">subsection has been shortened accordingly. We confirm that no dedicated</w:t>
       </w:r>
       <w:r>
         <w:t xml:space="preserve"> </w:t>

</xml_diff>